<commit_message>
Rebuild filled Cerba SOBC survey on the original Word template.
Keep the original docx package and write only document.xml so LibreOffice/Word
open the questionnaire instead of a broken package. Check native FORMCHECKBOX
fields from the Chinese answers, and mark subcontractors as N/A.

Co-authored-by: musiclvme <musiclvme@users.noreply.github.com>
</commit_message>
<xml_diff>
--- a/translate/Vendor_Survey_Laboratory_Cerba_Research_SOBC_V1_filled.docx
+++ b/translate/Vendor_Survey_Laboratory_Cerba_Research_SOBC_V1_filled.docx
@@ -2639,8 +2639,8 @@
                   <w:calcOnExit w:val="0"/>
                   <w:checkBox>
                     <w:sizeAuto/>
-                    <w:default w:val="0"/>
-                    <w:checked w:val="0"/>
+                    <w:default w:val="1"/>
+                    <w:checked w:val="1"/>
                   </w:checkBox>
                 </w:ffData>
               </w:fldChar>
@@ -2665,13 +2665,6 @@
               <w:fldChar w:fldCharType="end"/>
             </w:r>
             <w:bookmarkEnd w:id="0"/>
-            <w:r>
-              <w:rPr>
-                <w:rFonts w:ascii="Wingdings" w:hAnsi="Wingdings"/>
-                <w:sz w:val="22"/>
-              </w:rPr>
-              <w:sym w:font="Wingdings" w:char="00FE"/>
-            </w:r>
             <w:r>
               <w:rPr>
                 <w:rFonts w:ascii="Arial" w:hAnsi="Arial" w:cs="Arial"/>
@@ -3287,8 +3280,8 @@
                   <w:calcOnExit w:val="0"/>
                   <w:checkBox>
                     <w:sizeAuto/>
-                    <w:default w:val="0"/>
-                    <w:checked w:val="0"/>
+                    <w:default w:val="1"/>
+                    <w:checked w:val="1"/>
                   </w:checkBox>
                 </w:ffData>
               </w:fldChar>
@@ -3316,13 +3309,6 @@
                 <w:lang w:val="en-US"/>
               </w:rPr>
               <w:fldChar w:fldCharType="end"/>
-            </w:r>
-            <w:r>
-              <w:rPr>
-                <w:rFonts w:ascii="Wingdings" w:hAnsi="Wingdings"/>
-                <w:sz w:val="22"/>
-              </w:rPr>
-              <w:sym w:font="Wingdings" w:char="00FE"/>
             </w:r>
             <w:r>
               <w:rPr>
@@ -3878,8 +3864,8 @@
                   <w:calcOnExit w:val="0"/>
                   <w:checkBox>
                     <w:sizeAuto/>
-                    <w:default w:val="0"/>
-                    <w:checked w:val="0"/>
+                    <w:default w:val="1"/>
+                    <w:checked w:val="1"/>
                   </w:checkBox>
                 </w:ffData>
               </w:fldChar>
@@ -3907,13 +3893,6 @@
                 <w:lang w:val="en-US"/>
               </w:rPr>
               <w:fldChar w:fldCharType="end"/>
-            </w:r>
-            <w:r>
-              <w:rPr>
-                <w:rFonts w:ascii="Wingdings" w:hAnsi="Wingdings"/>
-                <w:sz w:val="22"/>
-              </w:rPr>
-              <w:sym w:font="Wingdings" w:char="00FE"/>
             </w:r>
             <w:r>
               <w:rPr>
@@ -4183,8 +4162,8 @@
                   <w:calcOnExit w:val="0"/>
                   <w:checkBox>
                     <w:sizeAuto/>
-                    <w:default w:val="0"/>
-                    <w:checked w:val="0"/>
+                    <w:default w:val="1"/>
+                    <w:checked w:val="1"/>
                   </w:checkBox>
                 </w:ffData>
               </w:fldChar>
@@ -4212,13 +4191,6 @@
                 <w:lang w:val="en-US"/>
               </w:rPr>
               <w:fldChar w:fldCharType="end"/>
-            </w:r>
-            <w:r>
-              <w:rPr>
-                <w:rFonts w:ascii="Wingdings" w:hAnsi="Wingdings"/>
-                <w:sz w:val="22"/>
-              </w:rPr>
-              <w:sym w:font="Wingdings" w:char="00FE"/>
             </w:r>
             <w:r>
               <w:rPr>
@@ -5946,8 +5918,8 @@
                   <w:calcOnExit w:val="0"/>
                   <w:checkBox>
                     <w:sizeAuto/>
-                    <w:default w:val="0"/>
-                    <w:checked w:val="0"/>
+                    <w:default w:val="1"/>
+                    <w:checked w:val="1"/>
                   </w:checkBox>
                 </w:ffData>
               </w:fldChar>
@@ -5969,13 +5941,6 @@
                 <w:rFonts w:ascii="Arial" w:hAnsi="Arial" w:cs="Arial"/>
               </w:rPr>
               <w:fldChar w:fldCharType="end"/>
-            </w:r>
-            <w:r>
-              <w:rPr>
-                <w:rFonts w:ascii="Wingdings" w:hAnsi="Wingdings"/>
-                <w:sz w:val="22"/>
-              </w:rPr>
-              <w:sym w:font="Wingdings" w:char="00FE"/>
             </w:r>
           </w:p>
         </w:tc>
@@ -6261,8 +6226,8 @@
                   <w:calcOnExit w:val="0"/>
                   <w:checkBox>
                     <w:sizeAuto/>
-                    <w:default w:val="0"/>
-                    <w:checked w:val="0"/>
+                    <w:default w:val="1"/>
+                    <w:checked w:val="1"/>
                   </w:checkBox>
                 </w:ffData>
               </w:fldChar>
@@ -6284,13 +6249,6 @@
                 <w:rFonts w:ascii="Arial" w:hAnsi="Arial" w:cs="Arial"/>
               </w:rPr>
               <w:fldChar w:fldCharType="end"/>
-            </w:r>
-            <w:r>
-              <w:rPr>
-                <w:rFonts w:ascii="Wingdings" w:hAnsi="Wingdings"/>
-                <w:sz w:val="22"/>
-              </w:rPr>
-              <w:sym w:font="Wingdings" w:char="00FE"/>
             </w:r>
           </w:p>
         </w:tc>
@@ -6507,8 +6465,8 @@
                   <w:calcOnExit w:val="0"/>
                   <w:checkBox>
                     <w:sizeAuto/>
-                    <w:default w:val="0"/>
-                    <w:checked w:val="0"/>
+                    <w:default w:val="1"/>
+                    <w:checked w:val="1"/>
                   </w:checkBox>
                 </w:ffData>
               </w:fldChar>
@@ -6530,13 +6488,6 @@
                 <w:rFonts w:ascii="Arial" w:hAnsi="Arial" w:cs="Arial"/>
               </w:rPr>
               <w:fldChar w:fldCharType="end"/>
-            </w:r>
-            <w:r>
-              <w:rPr>
-                <w:rFonts w:ascii="Wingdings" w:hAnsi="Wingdings"/>
-                <w:sz w:val="22"/>
-              </w:rPr>
-              <w:sym w:font="Wingdings" w:char="00FE"/>
             </w:r>
           </w:p>
         </w:tc>
@@ -6883,8 +6834,8 @@
                   <w:calcOnExit w:val="0"/>
                   <w:checkBox>
                     <w:sizeAuto/>
-                    <w:default w:val="0"/>
-                    <w:checked w:val="0"/>
+                    <w:default w:val="1"/>
+                    <w:checked w:val="1"/>
                   </w:checkBox>
                 </w:ffData>
               </w:fldChar>
@@ -6906,13 +6857,6 @@
                 <w:rFonts w:ascii="Arial" w:hAnsi="Arial" w:cs="Arial"/>
               </w:rPr>
               <w:fldChar w:fldCharType="end"/>
-            </w:r>
-            <w:r>
-              <w:rPr>
-                <w:rFonts w:ascii="Wingdings" w:hAnsi="Wingdings"/>
-                <w:sz w:val="22"/>
-              </w:rPr>
-              <w:sym w:font="Wingdings" w:char="00FE"/>
             </w:r>
           </w:p>
         </w:tc>
@@ -7231,13 +7175,6 @@
             </w:r>
           </w:p>
           <w:p>
-            <w:r>
-              <w:rPr>
-                <w:rFonts w:ascii="Wingdings" w:hAnsi="Wingdings"/>
-                <w:sz w:val="22"/>
-              </w:rPr>
-              <w:sym w:font="Wingdings" w:char="00FE"/>
-            </w:r>
             <w:pPr>
               <w:pStyle w:val="131"/>
               <w:keepNext/>
@@ -7261,8 +7198,8 @@
                   <w:calcOnExit w:val="0"/>
                   <w:checkBox>
                     <w:sizeAuto/>
-                    <w:default w:val="0"/>
-                    <w:checked w:val="0"/>
+                    <w:default w:val="1"/>
+                    <w:checked w:val="1"/>
                   </w:checkBox>
                 </w:ffData>
               </w:fldChar>
@@ -7695,8 +7632,8 @@
                   <w:calcOnExit w:val="0"/>
                   <w:checkBox>
                     <w:sizeAuto/>
-                    <w:default w:val="0"/>
-                    <w:checked w:val="0"/>
+                    <w:default w:val="1"/>
+                    <w:checked w:val="1"/>
                   </w:checkBox>
                 </w:ffData>
               </w:fldChar>
@@ -7718,13 +7655,6 @@
                 <w:rFonts w:ascii="Arial" w:hAnsi="Arial" w:cs="Arial"/>
               </w:rPr>
               <w:fldChar w:fldCharType="end"/>
-            </w:r>
-            <w:r>
-              <w:rPr>
-                <w:rFonts w:ascii="Wingdings" w:hAnsi="Wingdings"/>
-                <w:sz w:val="22"/>
-              </w:rPr>
-              <w:sym w:font="Wingdings" w:char="00FE"/>
             </w:r>
           </w:p>
         </w:tc>
@@ -8901,8 +8831,8 @@
                   <w:calcOnExit w:val="0"/>
                   <w:checkBox>
                     <w:sizeAuto/>
-                    <w:default w:val="0"/>
-                    <w:checked w:val="0"/>
+                    <w:default w:val="1"/>
+                    <w:checked w:val="1"/>
                   </w:checkBox>
                 </w:ffData>
               </w:fldChar>
@@ -8927,13 +8857,6 @@
                 <w:highlight w:val="lightGray"/>
               </w:rPr>
               <w:fldChar w:fldCharType="end"/>
-            </w:r>
-            <w:r>
-              <w:rPr>
-                <w:rFonts w:ascii="Wingdings" w:hAnsi="Wingdings"/>
-                <w:sz w:val="22"/>
-              </w:rPr>
-              <w:sym w:font="Wingdings" w:char="00FE"/>
             </w:r>
           </w:p>
         </w:tc>
@@ -9280,8 +9203,8 @@
                   <w:calcOnExit w:val="0"/>
                   <w:checkBox>
                     <w:sizeAuto/>
-                    <w:default w:val="0"/>
-                    <w:checked w:val="0"/>
+                    <w:default w:val="1"/>
+                    <w:checked w:val="1"/>
                   </w:checkBox>
                 </w:ffData>
               </w:fldChar>
@@ -9306,13 +9229,6 @@
                 <w:highlight w:val="lightGray"/>
               </w:rPr>
               <w:fldChar w:fldCharType="end"/>
-            </w:r>
-            <w:r>
-              <w:rPr>
-                <w:rFonts w:ascii="Wingdings" w:hAnsi="Wingdings"/>
-                <w:sz w:val="22"/>
-              </w:rPr>
-              <w:sym w:font="Wingdings" w:char="00FE"/>
             </w:r>
           </w:p>
         </w:tc>
@@ -9519,8 +9435,8 @@
                   <w:calcOnExit w:val="0"/>
                   <w:checkBox>
                     <w:sizeAuto/>
-                    <w:default w:val="0"/>
-                    <w:checked w:val="0"/>
+                    <w:default w:val="1"/>
+                    <w:checked w:val="1"/>
                   </w:checkBox>
                 </w:ffData>
               </w:fldChar>
@@ -9545,13 +9461,6 @@
                 <w:highlight w:val="lightGray"/>
               </w:rPr>
               <w:fldChar w:fldCharType="end"/>
-            </w:r>
-            <w:r>
-              <w:rPr>
-                <w:rFonts w:ascii="Wingdings" w:hAnsi="Wingdings"/>
-                <w:sz w:val="22"/>
-              </w:rPr>
-              <w:sym w:font="Wingdings" w:char="00FE"/>
             </w:r>
           </w:p>
         </w:tc>
@@ -9756,8 +9665,8 @@
                   <w:calcOnExit w:val="0"/>
                   <w:checkBox>
                     <w:sizeAuto/>
-                    <w:default w:val="0"/>
-                    <w:checked w:val="0"/>
+                    <w:default w:val="1"/>
+                    <w:checked w:val="1"/>
                   </w:checkBox>
                 </w:ffData>
               </w:fldChar>
@@ -9782,13 +9691,6 @@
                 <w:highlight w:val="lightGray"/>
               </w:rPr>
               <w:fldChar w:fldCharType="end"/>
-            </w:r>
-            <w:r>
-              <w:rPr>
-                <w:rFonts w:ascii="Wingdings" w:hAnsi="Wingdings"/>
-                <w:sz w:val="22"/>
-              </w:rPr>
-              <w:sym w:font="Wingdings" w:char="00FE"/>
             </w:r>
           </w:p>
         </w:tc>
@@ -10133,8 +10035,8 @@
                   <w:calcOnExit w:val="0"/>
                   <w:checkBox>
                     <w:sizeAuto/>
-                    <w:default w:val="0"/>
-                    <w:checked w:val="0"/>
+                    <w:default w:val="1"/>
+                    <w:checked w:val="1"/>
                   </w:checkBox>
                 </w:ffData>
               </w:fldChar>
@@ -10159,13 +10061,6 @@
                 <w:highlight w:val="lightGray"/>
               </w:rPr>
               <w:fldChar w:fldCharType="end"/>
-            </w:r>
-            <w:r>
-              <w:rPr>
-                <w:rFonts w:ascii="Wingdings" w:hAnsi="Wingdings"/>
-                <w:sz w:val="22"/>
-              </w:rPr>
-              <w:sym w:font="Wingdings" w:char="00FE"/>
             </w:r>
           </w:p>
         </w:tc>
@@ -10442,8 +10337,8 @@
                   <w:calcOnExit w:val="0"/>
                   <w:checkBox>
                     <w:sizeAuto/>
-                    <w:default w:val="0"/>
-                    <w:checked w:val="0"/>
+                    <w:default w:val="1"/>
+                    <w:checked w:val="1"/>
                   </w:checkBox>
                 </w:ffData>
               </w:fldChar>
@@ -10468,13 +10363,6 @@
                 <w:highlight w:val="lightGray"/>
               </w:rPr>
               <w:fldChar w:fldCharType="end"/>
-            </w:r>
-            <w:r>
-              <w:rPr>
-                <w:rFonts w:ascii="Wingdings" w:hAnsi="Wingdings"/>
-                <w:sz w:val="22"/>
-              </w:rPr>
-              <w:sym w:font="Wingdings" w:char="00FE"/>
             </w:r>
           </w:p>
         </w:tc>
@@ -10579,8 +10467,8 @@
                   <w:calcOnExit w:val="0"/>
                   <w:checkBox>
                     <w:sizeAuto/>
-                    <w:default w:val="0"/>
-                    <w:checked w:val="0"/>
+                    <w:default w:val="1"/>
+                    <w:checked w:val="1"/>
                   </w:checkBox>
                 </w:ffData>
               </w:fldChar>
@@ -10605,13 +10493,6 @@
                 <w:highlight w:val="lightGray"/>
               </w:rPr>
               <w:fldChar w:fldCharType="end"/>
-            </w:r>
-            <w:r>
-              <w:rPr>
-                <w:rFonts w:ascii="Wingdings" w:hAnsi="Wingdings"/>
-                <w:sz w:val="22"/>
-              </w:rPr>
-              <w:sym w:font="Wingdings" w:char="00FE"/>
             </w:r>
           </w:p>
         </w:tc>
@@ -10924,8 +10805,8 @@
                   <w:calcOnExit w:val="0"/>
                   <w:checkBox>
                     <w:sizeAuto/>
-                    <w:default w:val="0"/>
-                    <w:checked w:val="0"/>
+                    <w:default w:val="1"/>
+                    <w:checked w:val="1"/>
                   </w:checkBox>
                 </w:ffData>
               </w:fldChar>
@@ -10950,13 +10831,6 @@
                 <w:highlight w:val="lightGray"/>
               </w:rPr>
               <w:fldChar w:fldCharType="end"/>
-            </w:r>
-            <w:r>
-              <w:rPr>
-                <w:rFonts w:ascii="Wingdings" w:hAnsi="Wingdings"/>
-                <w:sz w:val="22"/>
-              </w:rPr>
-              <w:sym w:font="Wingdings" w:char="00FE"/>
             </w:r>
           </w:p>
         </w:tc>
@@ -11402,8 +11276,8 @@
                   <w:calcOnExit w:val="0"/>
                   <w:checkBox>
                     <w:sizeAuto/>
-                    <w:default w:val="0"/>
-                    <w:checked w:val="0"/>
+                    <w:default w:val="1"/>
+                    <w:checked w:val="1"/>
                   </w:checkBox>
                 </w:ffData>
               </w:fldChar>
@@ -11425,13 +11299,6 @@
                 <w:rFonts w:ascii="Arial" w:hAnsi="Arial" w:cs="Arial"/>
               </w:rPr>
               <w:fldChar w:fldCharType="end"/>
-            </w:r>
-            <w:r>
-              <w:rPr>
-                <w:rFonts w:ascii="Wingdings" w:hAnsi="Wingdings"/>
-                <w:sz w:val="22"/>
-              </w:rPr>
-              <w:sym w:font="Wingdings" w:char="00FE"/>
             </w:r>
           </w:p>
         </w:tc>
@@ -11704,13 +11571,6 @@
             <w:vAlign w:val="center"/>
           </w:tcPr>
           <w:p>
-            <w:r>
-              <w:rPr>
-                <w:rFonts w:ascii="Wingdings" w:hAnsi="Wingdings"/>
-                <w:sz w:val="22"/>
-              </w:rPr>
-              <w:sym w:font="Wingdings" w:char="00FE"/>
-            </w:r>
             <w:pPr>
               <w:ind w:left="1"/>
               <w:rPr>
@@ -11728,8 +11588,8 @@
                   <w:calcOnExit w:val="0"/>
                   <w:checkBox>
                     <w:sizeAuto/>
-                    <w:default w:val="0"/>
-                    <w:checked w:val="0"/>
+                    <w:default w:val="1"/>
+                    <w:checked w:val="1"/>
                   </w:checkBox>
                 </w:ffData>
               </w:fldChar>
@@ -11760,13 +11620,6 @@
             </w:r>
           </w:p>
           <w:p>
-            <w:r>
-              <w:rPr>
-                <w:rFonts w:ascii="Wingdings" w:hAnsi="Wingdings"/>
-                <w:sz w:val="22"/>
-              </w:rPr>
-              <w:sym w:font="Wingdings" w:char="00FE"/>
-            </w:r>
             <w:pPr>
               <w:ind w:left="1"/>
               <w:rPr>
@@ -11784,8 +11637,8 @@
                   <w:calcOnExit w:val="0"/>
                   <w:checkBox>
                     <w:sizeAuto/>
-                    <w:default w:val="0"/>
-                    <w:checked w:val="0"/>
+                    <w:default w:val="1"/>
+                    <w:checked w:val="1"/>
                   </w:checkBox>
                 </w:ffData>
               </w:fldChar>
@@ -11816,13 +11669,6 @@
             </w:r>
           </w:p>
           <w:p>
-            <w:r>
-              <w:rPr>
-                <w:rFonts w:ascii="Wingdings" w:hAnsi="Wingdings"/>
-                <w:sz w:val="22"/>
-              </w:rPr>
-              <w:sym w:font="Wingdings" w:char="00FE"/>
-            </w:r>
             <w:pPr>
               <w:ind w:left="1"/>
               <w:rPr>
@@ -11840,8 +11686,8 @@
                   <w:calcOnExit w:val="0"/>
                   <w:checkBox>
                     <w:sizeAuto/>
-                    <w:default w:val="0"/>
-                    <w:checked w:val="0"/>
+                    <w:default w:val="1"/>
+                    <w:checked w:val="1"/>
                   </w:checkBox>
                 </w:ffData>
               </w:fldChar>
@@ -11875,13 +11721,6 @@
             </w:r>
           </w:p>
           <w:p>
-            <w:r>
-              <w:rPr>
-                <w:rFonts w:ascii="Wingdings" w:hAnsi="Wingdings"/>
-                <w:sz w:val="22"/>
-              </w:rPr>
-              <w:sym w:font="Wingdings" w:char="00FE"/>
-            </w:r>
             <w:pPr>
               <w:ind w:left="1"/>
               <w:rPr>
@@ -11899,8 +11738,8 @@
                   <w:calcOnExit w:val="0"/>
                   <w:checkBox>
                     <w:sizeAuto/>
-                    <w:default w:val="0"/>
-                    <w:checked w:val="0"/>
+                    <w:default w:val="1"/>
+                    <w:checked w:val="1"/>
                   </w:checkBox>
                 </w:ffData>
               </w:fldChar>
@@ -11931,13 +11770,6 @@
             </w:r>
           </w:p>
           <w:p>
-            <w:r>
-              <w:rPr>
-                <w:rFonts w:ascii="Wingdings" w:hAnsi="Wingdings"/>
-                <w:sz w:val="22"/>
-              </w:rPr>
-              <w:sym w:font="Wingdings" w:char="00FE"/>
-            </w:r>
             <w:pPr>
               <w:ind w:left="1"/>
               <w:rPr>
@@ -11955,8 +11787,8 @@
                   <w:calcOnExit w:val="0"/>
                   <w:checkBox>
                     <w:sizeAuto/>
-                    <w:default w:val="0"/>
-                    <w:checked w:val="0"/>
+                    <w:default w:val="1"/>
+                    <w:checked w:val="1"/>
                   </w:checkBox>
                 </w:ffData>
               </w:fldChar>
@@ -11987,13 +11819,6 @@
             </w:r>
           </w:p>
           <w:p>
-            <w:r>
-              <w:rPr>
-                <w:rFonts w:ascii="Wingdings" w:hAnsi="Wingdings"/>
-                <w:sz w:val="22"/>
-              </w:rPr>
-              <w:sym w:font="Wingdings" w:char="00FE"/>
-            </w:r>
             <w:pPr>
               <w:ind w:left="1"/>
               <w:rPr>
@@ -12012,8 +11837,8 @@
                   <w:calcOnExit w:val="0"/>
                   <w:checkBox>
                     <w:sizeAuto/>
-                    <w:default w:val="0"/>
-                    <w:checked w:val="0"/>
+                    <w:default w:val="1"/>
+                    <w:checked w:val="1"/>
                   </w:checkBox>
                 </w:ffData>
               </w:fldChar>
@@ -12132,8 +11957,8 @@
                   <w:calcOnExit w:val="0"/>
                   <w:checkBox>
                     <w:sizeAuto/>
-                    <w:default w:val="0"/>
-                    <w:checked w:val="0"/>
+                    <w:default w:val="1"/>
+                    <w:checked w:val="1"/>
                   </w:checkBox>
                 </w:ffData>
               </w:fldChar>
@@ -12155,13 +11980,6 @@
                 <w:rFonts w:ascii="Arial" w:hAnsi="Arial" w:cs="Arial"/>
               </w:rPr>
               <w:fldChar w:fldCharType="end"/>
-            </w:r>
-            <w:r>
-              <w:rPr>
-                <w:rFonts w:ascii="Wingdings" w:hAnsi="Wingdings"/>
-                <w:sz w:val="22"/>
-              </w:rPr>
-              <w:sym w:font="Wingdings" w:char="00FE"/>
             </w:r>
           </w:p>
         </w:tc>
@@ -12453,7 +12271,7 @@
                   <w:checkBox>
                     <w:sizeAuto/>
                     <w:default w:val="1"/>
-                    <w:checked/>
+                    <w:checked w:val="1"/>
                   </w:checkBox>
                 </w:ffData>
               </w:fldChar>
@@ -12484,13 +12302,6 @@
                 <w:lang w:val="en-US" w:eastAsia="en-US" w:bidi="ar-SA"/>
               </w:rPr>
               <w:fldChar w:fldCharType="end"/>
-            </w:r>
-            <w:r>
-              <w:rPr>
-                <w:rFonts w:ascii="Wingdings" w:hAnsi="Wingdings"/>
-                <w:sz w:val="22"/>
-              </w:rPr>
-              <w:sym w:font="Wingdings" w:char="00FE"/>
             </w:r>
           </w:p>
         </w:tc>
@@ -12858,7 +12669,7 @@
                   <w:checkBox>
                     <w:sizeAuto/>
                     <w:default w:val="1"/>
-                    <w:checked/>
+                    <w:checked w:val="1"/>
                   </w:checkBox>
                 </w:ffData>
               </w:fldChar>
@@ -12889,13 +12700,6 @@
                 <w:lang w:val="en-US" w:eastAsia="en-US" w:bidi="ar-SA"/>
               </w:rPr>
               <w:fldChar w:fldCharType="end"/>
-            </w:r>
-            <w:r>
-              <w:rPr>
-                <w:rFonts w:ascii="Wingdings" w:hAnsi="Wingdings"/>
-                <w:sz w:val="22"/>
-              </w:rPr>
-              <w:sym w:font="Wingdings" w:char="00FE"/>
             </w:r>
           </w:p>
         </w:tc>
@@ -13377,7 +13181,7 @@
                   <w:checkBox>
                     <w:sizeAuto/>
                     <w:default w:val="1"/>
-                    <w:checked/>
+                    <w:checked w:val="1"/>
                   </w:checkBox>
                 </w:ffData>
               </w:fldChar>
@@ -13408,13 +13212,6 @@
                 <w:lang w:val="en-US" w:eastAsia="en-US" w:bidi="ar-SA"/>
               </w:rPr>
               <w:fldChar w:fldCharType="end"/>
-            </w:r>
-            <w:r>
-              <w:rPr>
-                <w:rFonts w:ascii="Wingdings" w:hAnsi="Wingdings"/>
-                <w:sz w:val="22"/>
-              </w:rPr>
-              <w:sym w:font="Wingdings" w:char="00FE"/>
             </w:r>
           </w:p>
         </w:tc>
@@ -13857,7 +13654,7 @@
                   <w:checkBox>
                     <w:sizeAuto/>
                     <w:default w:val="1"/>
-                    <w:checked/>
+                    <w:checked w:val="1"/>
                   </w:checkBox>
                 </w:ffData>
               </w:fldChar>
@@ -13888,13 +13685,6 @@
                 <w:lang w:val="en-US" w:eastAsia="en-US" w:bidi="ar-SA"/>
               </w:rPr>
               <w:fldChar w:fldCharType="end"/>
-            </w:r>
-            <w:r>
-              <w:rPr>
-                <w:rFonts w:ascii="Wingdings" w:hAnsi="Wingdings"/>
-                <w:sz w:val="22"/>
-              </w:rPr>
-              <w:sym w:font="Wingdings" w:char="00FE"/>
             </w:r>
           </w:p>
         </w:tc>
@@ -14007,7 +13797,7 @@
                   <w:checkBox>
                     <w:sizeAuto/>
                     <w:default w:val="1"/>
-                    <w:checked/>
+                    <w:checked w:val="1"/>
                   </w:checkBox>
                 </w:ffData>
               </w:fldChar>
@@ -14038,13 +13828,6 @@
                 <w:lang w:val="en-US" w:eastAsia="en-US" w:bidi="ar-SA"/>
               </w:rPr>
               <w:fldChar w:fldCharType="end"/>
-            </w:r>
-            <w:r>
-              <w:rPr>
-                <w:rFonts w:ascii="Wingdings" w:hAnsi="Wingdings"/>
-                <w:sz w:val="22"/>
-              </w:rPr>
-              <w:sym w:font="Wingdings" w:char="00FE"/>
             </w:r>
           </w:p>
         </w:tc>
@@ -14491,7 +14274,7 @@
                   <w:checkBox>
                     <w:sizeAuto/>
                     <w:default w:val="1"/>
-                    <w:checked/>
+                    <w:checked w:val="1"/>
                   </w:checkBox>
                 </w:ffData>
               </w:fldChar>
@@ -14522,13 +14305,6 @@
                 <w:lang w:val="en-US" w:eastAsia="en-US" w:bidi="ar-SA"/>
               </w:rPr>
               <w:fldChar w:fldCharType="end"/>
-            </w:r>
-            <w:r>
-              <w:rPr>
-                <w:rFonts w:ascii="Wingdings" w:hAnsi="Wingdings"/>
-                <w:sz w:val="22"/>
-              </w:rPr>
-              <w:sym w:font="Wingdings" w:char="00FE"/>
             </w:r>
           </w:p>
         </w:tc>
@@ -14749,7 +14525,7 @@
                   <w:checkBox>
                     <w:sizeAuto/>
                     <w:default w:val="1"/>
-                    <w:checked/>
+                    <w:checked w:val="1"/>
                   </w:checkBox>
                 </w:ffData>
               </w:fldChar>
@@ -14780,13 +14556,6 @@
                 <w:lang w:val="en-US" w:eastAsia="en-US" w:bidi="ar-SA"/>
               </w:rPr>
               <w:fldChar w:fldCharType="end"/>
-            </w:r>
-            <w:r>
-              <w:rPr>
-                <w:rFonts w:ascii="Wingdings" w:hAnsi="Wingdings"/>
-                <w:sz w:val="22"/>
-              </w:rPr>
-              <w:sym w:font="Wingdings" w:char="00FE"/>
             </w:r>
           </w:p>
         </w:tc>
@@ -15008,7 +14777,7 @@
                   <w:checkBox>
                     <w:sizeAuto/>
                     <w:default w:val="1"/>
-                    <w:checked/>
+                    <w:checked w:val="1"/>
                   </w:checkBox>
                 </w:ffData>
               </w:fldChar>
@@ -15039,13 +14808,6 @@
                 <w:lang w:val="en-US" w:eastAsia="en-US" w:bidi="ar-SA"/>
               </w:rPr>
               <w:fldChar w:fldCharType="end"/>
-            </w:r>
-            <w:r>
-              <w:rPr>
-                <w:rFonts w:ascii="Wingdings" w:hAnsi="Wingdings"/>
-                <w:sz w:val="22"/>
-              </w:rPr>
-              <w:sym w:font="Wingdings" w:char="00FE"/>
             </w:r>
           </w:p>
         </w:tc>
@@ -15267,7 +15029,7 @@
                   <w:checkBox>
                     <w:sizeAuto/>
                     <w:default w:val="1"/>
-                    <w:checked/>
+                    <w:checked w:val="1"/>
                   </w:checkBox>
                 </w:ffData>
               </w:fldChar>
@@ -15298,13 +15060,6 @@
                 <w:lang w:val="en-US" w:eastAsia="en-US" w:bidi="ar-SA"/>
               </w:rPr>
               <w:fldChar w:fldCharType="end"/>
-            </w:r>
-            <w:r>
-              <w:rPr>
-                <w:rFonts w:ascii="Wingdings" w:hAnsi="Wingdings"/>
-                <w:sz w:val="22"/>
-              </w:rPr>
-              <w:sym w:font="Wingdings" w:char="00FE"/>
             </w:r>
           </w:p>
         </w:tc>
@@ -15644,7 +15399,7 @@
                   <w:checkBox>
                     <w:sizeAuto/>
                     <w:default w:val="1"/>
-                    <w:checked/>
+                    <w:checked w:val="1"/>
                   </w:checkBox>
                 </w:ffData>
               </w:fldChar>
@@ -15675,13 +15430,6 @@
                 <w:lang w:val="en-US" w:eastAsia="en-US" w:bidi="ar-SA"/>
               </w:rPr>
               <w:fldChar w:fldCharType="end"/>
-            </w:r>
-            <w:r>
-              <w:rPr>
-                <w:rFonts w:ascii="Wingdings" w:hAnsi="Wingdings"/>
-                <w:sz w:val="22"/>
-              </w:rPr>
-              <w:sym w:font="Wingdings" w:char="00FE"/>
             </w:r>
           </w:p>
         </w:tc>
@@ -15904,7 +15652,7 @@
                   <w:checkBox>
                     <w:sizeAuto/>
                     <w:default w:val="1"/>
-                    <w:checked/>
+                    <w:checked w:val="1"/>
                   </w:checkBox>
                 </w:ffData>
               </w:fldChar>
@@ -15935,13 +15683,6 @@
                 <w:lang w:val="en-US" w:eastAsia="en-US" w:bidi="ar-SA"/>
               </w:rPr>
               <w:fldChar w:fldCharType="end"/>
-            </w:r>
-            <w:r>
-              <w:rPr>
-                <w:rFonts w:ascii="Wingdings" w:hAnsi="Wingdings"/>
-                <w:sz w:val="22"/>
-              </w:rPr>
-              <w:sym w:font="Wingdings" w:char="00FE"/>
             </w:r>
           </w:p>
         </w:tc>
@@ -16210,8 +15951,8 @@
                   <w:calcOnExit w:val="0"/>
                   <w:checkBox>
                     <w:sizeAuto/>
-                    <w:default w:val="0"/>
-                    <w:checked w:val="0"/>
+                    <w:default w:val="1"/>
+                    <w:checked w:val="1"/>
                   </w:checkBox>
                 </w:ffData>
               </w:fldChar>
@@ -16233,13 +15974,6 @@
                 <w:rFonts w:ascii="Arial" w:hAnsi="Arial" w:cs="Arial"/>
               </w:rPr>
               <w:fldChar w:fldCharType="end"/>
-            </w:r>
-            <w:r>
-              <w:rPr>
-                <w:rFonts w:ascii="Wingdings" w:hAnsi="Wingdings"/>
-                <w:sz w:val="22"/>
-              </w:rPr>
-              <w:sym w:font="Wingdings" w:char="00FE"/>
             </w:r>
           </w:p>
         </w:tc>
@@ -16270,8 +16004,8 @@
                   <w:calcOnExit w:val="0"/>
                   <w:checkBox>
                     <w:sizeAuto/>
-                    <w:default w:val="1"/>
-                    <w:checked/>
+                    <w:default w:val="0"/>
+                    <w:checked w:val="0"/>
                   </w:checkBox>
                 </w:ffData>
               </w:fldChar>
@@ -16681,7 +16415,7 @@
                   <w:checkBox>
                     <w:sizeAuto/>
                     <w:default w:val="1"/>
-                    <w:checked/>
+                    <w:checked w:val="1"/>
                   </w:checkBox>
                 </w:ffData>
               </w:fldChar>
@@ -16712,13 +16446,6 @@
                 <w:lang w:val="en-US" w:eastAsia="en-US" w:bidi="ar-SA"/>
               </w:rPr>
               <w:fldChar w:fldCharType="end"/>
-            </w:r>
-            <w:r>
-              <w:rPr>
-                <w:rFonts w:ascii="Wingdings" w:hAnsi="Wingdings"/>
-                <w:sz w:val="22"/>
-              </w:rPr>
-              <w:sym w:font="Wingdings" w:char="00FE"/>
             </w:r>
           </w:p>
         </w:tc>
@@ -17152,7 +16879,7 @@
                   <w:checkBox>
                     <w:sizeAuto/>
                     <w:default w:val="1"/>
-                    <w:checked/>
+                    <w:checked w:val="1"/>
                   </w:checkBox>
                 </w:ffData>
               </w:fldChar>
@@ -17183,13 +16910,6 @@
                 <w:lang w:val="en-US" w:eastAsia="en-US" w:bidi="ar-SA"/>
               </w:rPr>
               <w:fldChar w:fldCharType="end"/>
-            </w:r>
-            <w:r>
-              <w:rPr>
-                <w:rFonts w:ascii="Wingdings" w:hAnsi="Wingdings"/>
-                <w:sz w:val="22"/>
-              </w:rPr>
-              <w:sym w:font="Wingdings" w:char="00FE"/>
             </w:r>
           </w:p>
         </w:tc>
@@ -17636,7 +17356,7 @@
                   <w:checkBox>
                     <w:sizeAuto/>
                     <w:default w:val="1"/>
-                    <w:checked/>
+                    <w:checked w:val="1"/>
                   </w:checkBox>
                 </w:ffData>
               </w:fldChar>
@@ -17667,13 +17387,6 @@
                 <w:lang w:val="en-US" w:eastAsia="en-US" w:bidi="ar-SA"/>
               </w:rPr>
               <w:fldChar w:fldCharType="end"/>
-            </w:r>
-            <w:r>
-              <w:rPr>
-                <w:rFonts w:ascii="Wingdings" w:hAnsi="Wingdings"/>
-                <w:sz w:val="22"/>
-              </w:rPr>
-              <w:sym w:font="Wingdings" w:char="00FE"/>
             </w:r>
           </w:p>
         </w:tc>
@@ -17928,7 +17641,7 @@
                   <w:checkBox>
                     <w:sizeAuto/>
                     <w:default w:val="1"/>
-                    <w:checked/>
+                    <w:checked w:val="1"/>
                   </w:checkBox>
                 </w:ffData>
               </w:fldChar>
@@ -17959,13 +17672,6 @@
                 <w:lang w:val="en-US" w:eastAsia="en-US" w:bidi="ar-SA"/>
               </w:rPr>
               <w:fldChar w:fldCharType="end"/>
-            </w:r>
-            <w:r>
-              <w:rPr>
-                <w:rFonts w:ascii="Wingdings" w:hAnsi="Wingdings"/>
-                <w:sz w:val="22"/>
-              </w:rPr>
-              <w:sym w:font="Wingdings" w:char="00FE"/>
             </w:r>
           </w:p>
         </w:tc>
@@ -18171,7 +17877,7 @@
                   <w:checkBox>
                     <w:sizeAuto/>
                     <w:default w:val="1"/>
-                    <w:checked/>
+                    <w:checked w:val="1"/>
                   </w:checkBox>
                 </w:ffData>
               </w:fldChar>
@@ -18202,13 +17908,6 @@
                 <w:lang w:val="en-US" w:eastAsia="en-US" w:bidi="ar-SA"/>
               </w:rPr>
               <w:fldChar w:fldCharType="end"/>
-            </w:r>
-            <w:r>
-              <w:rPr>
-                <w:rFonts w:ascii="Wingdings" w:hAnsi="Wingdings"/>
-                <w:sz w:val="22"/>
-              </w:rPr>
-              <w:sym w:font="Wingdings" w:char="00FE"/>
             </w:r>
           </w:p>
         </w:tc>
@@ -18448,7 +18147,7 @@
                   <w:checkBox>
                     <w:sizeAuto/>
                     <w:default w:val="1"/>
-                    <w:checked/>
+                    <w:checked w:val="1"/>
                   </w:checkBox>
                 </w:ffData>
               </w:fldChar>
@@ -18479,13 +18178,6 @@
                 <w:lang w:val="en-US" w:eastAsia="en-US" w:bidi="ar-SA"/>
               </w:rPr>
               <w:fldChar w:fldCharType="end"/>
-            </w:r>
-            <w:r>
-              <w:rPr>
-                <w:rFonts w:ascii="Wingdings" w:hAnsi="Wingdings"/>
-                <w:sz w:val="22"/>
-              </w:rPr>
-              <w:sym w:font="Wingdings" w:char="00FE"/>
             </w:r>
           </w:p>
         </w:tc>
@@ -19379,13 +19071,6 @@
             </w:r>
           </w:p>
           <w:p>
-            <w:r>
-              <w:rPr>
-                <w:rFonts w:ascii="Wingdings" w:hAnsi="Wingdings"/>
-                <w:sz w:val="22"/>
-              </w:rPr>
-              <w:sym w:font="Wingdings" w:char="00FE"/>
-            </w:r>
             <w:pPr>
               <w:autoSpaceDE w:val="0"/>
               <w:autoSpaceDN w:val="0"/>
@@ -19413,7 +19098,7 @@
                   <w:checkBox>
                     <w:sizeAuto/>
                     <w:default w:val="1"/>
-                    <w:checked/>
+                    <w:checked w:val="1"/>
                   </w:checkBox>
                 </w:ffData>
               </w:fldChar>
@@ -19540,7 +19225,7 @@
                   <w:checkBox>
                     <w:sizeAuto/>
                     <w:default w:val="1"/>
-                    <w:checked/>
+                    <w:checked w:val="1"/>
                   </w:checkBox>
                 </w:ffData>
               </w:fldChar>
@@ -19914,7 +19599,7 @@
                   <w:checkBox>
                     <w:sizeAuto/>
                     <w:default w:val="1"/>
-                    <w:checked/>
+                    <w:checked w:val="1"/>
                   </w:checkBox>
                 </w:ffData>
               </w:fldChar>
@@ -19945,13 +19630,6 @@
                 <w:lang w:val="en-US" w:eastAsia="en-US" w:bidi="ar-SA"/>
               </w:rPr>
               <w:fldChar w:fldCharType="end"/>
-            </w:r>
-            <w:r>
-              <w:rPr>
-                <w:rFonts w:ascii="Wingdings" w:hAnsi="Wingdings"/>
-                <w:sz w:val="22"/>
-              </w:rPr>
-              <w:sym w:font="Wingdings" w:char="00FE"/>
             </w:r>
           </w:p>
         </w:tc>
@@ -20211,7 +19889,7 @@
                   <w:checkBox>
                     <w:sizeAuto/>
                     <w:default w:val="1"/>
-                    <w:checked/>
+                    <w:checked w:val="1"/>
                   </w:checkBox>
                 </w:ffData>
               </w:fldChar>
@@ -20242,13 +19920,6 @@
                 <w:lang w:val="en-US" w:eastAsia="en-US" w:bidi="ar-SA"/>
               </w:rPr>
               <w:fldChar w:fldCharType="end"/>
-            </w:r>
-            <w:r>
-              <w:rPr>
-                <w:rFonts w:ascii="Wingdings" w:hAnsi="Wingdings"/>
-                <w:sz w:val="22"/>
-              </w:rPr>
-              <w:sym w:font="Wingdings" w:char="00FE"/>
             </w:r>
           </w:p>
         </w:tc>
@@ -20563,7 +20234,7 @@
                   <w:checkBox>
                     <w:sizeAuto/>
                     <w:default w:val="1"/>
-                    <w:checked/>
+                    <w:checked w:val="1"/>
                   </w:checkBox>
                 </w:ffData>
               </w:fldChar>
@@ -20594,13 +20265,6 @@
                 <w:lang w:val="en-US" w:eastAsia="en-US" w:bidi="ar-SA"/>
               </w:rPr>
               <w:fldChar w:fldCharType="end"/>
-            </w:r>
-            <w:r>
-              <w:rPr>
-                <w:rFonts w:ascii="Wingdings" w:hAnsi="Wingdings"/>
-                <w:sz w:val="22"/>
-              </w:rPr>
-              <w:sym w:font="Wingdings" w:char="00FE"/>
             </w:r>
           </w:p>
         </w:tc>
@@ -20834,7 +20498,7 @@
                   <w:checkBox>
                     <w:sizeAuto/>
                     <w:default w:val="1"/>
-                    <w:checked/>
+                    <w:checked w:val="1"/>
                   </w:checkBox>
                 </w:ffData>
               </w:fldChar>
@@ -20865,13 +20529,6 @@
                 <w:lang w:val="en-US" w:eastAsia="en-US" w:bidi="ar-SA"/>
               </w:rPr>
               <w:fldChar w:fldCharType="end"/>
-            </w:r>
-            <w:r>
-              <w:rPr>
-                <w:rFonts w:ascii="Wingdings" w:hAnsi="Wingdings"/>
-                <w:sz w:val="22"/>
-              </w:rPr>
-              <w:sym w:font="Wingdings" w:char="00FE"/>
             </w:r>
           </w:p>
         </w:tc>
@@ -21160,7 +20817,7 @@
                   <w:checkBox>
                     <w:sizeAuto/>
                     <w:default w:val="1"/>
-                    <w:checked/>
+                    <w:checked w:val="1"/>
                   </w:checkBox>
                 </w:ffData>
               </w:fldChar>
@@ -21191,13 +20848,6 @@
                 <w:lang w:val="en-US" w:eastAsia="en-US" w:bidi="ar-SA"/>
               </w:rPr>
               <w:fldChar w:fldCharType="end"/>
-            </w:r>
-            <w:r>
-              <w:rPr>
-                <w:rFonts w:ascii="Wingdings" w:hAnsi="Wingdings"/>
-                <w:sz w:val="22"/>
-              </w:rPr>
-              <w:sym w:font="Wingdings" w:char="00FE"/>
             </w:r>
           </w:p>
         </w:tc>
@@ -21466,7 +21116,7 @@
                   <w:checkBox>
                     <w:sizeAuto/>
                     <w:default w:val="1"/>
-                    <w:checked/>
+                    <w:checked w:val="1"/>
                   </w:checkBox>
                 </w:ffData>
               </w:fldChar>
@@ -21497,13 +21147,6 @@
                 <w:lang w:val="en-US" w:eastAsia="en-US" w:bidi="ar-SA"/>
               </w:rPr>
               <w:fldChar w:fldCharType="end"/>
-            </w:r>
-            <w:r>
-              <w:rPr>
-                <w:rFonts w:ascii="Wingdings" w:hAnsi="Wingdings"/>
-                <w:sz w:val="22"/>
-              </w:rPr>
-              <w:sym w:font="Wingdings" w:char="00FE"/>
             </w:r>
           </w:p>
         </w:tc>
@@ -21605,7 +21248,7 @@
                   <w:checkBox>
                     <w:sizeAuto/>
                     <w:default w:val="1"/>
-                    <w:checked/>
+                    <w:checked w:val="1"/>
                   </w:checkBox>
                 </w:ffData>
               </w:fldChar>
@@ -21636,13 +21279,6 @@
                 <w:lang w:val="en-US" w:eastAsia="en-US" w:bidi="ar-SA"/>
               </w:rPr>
               <w:fldChar w:fldCharType="end"/>
-            </w:r>
-            <w:r>
-              <w:rPr>
-                <w:rFonts w:ascii="Wingdings" w:hAnsi="Wingdings"/>
-                <w:sz w:val="22"/>
-              </w:rPr>
-              <w:sym w:font="Wingdings" w:char="00FE"/>
             </w:r>
           </w:p>
         </w:tc>
@@ -22175,7 +21811,7 @@
                   <w:checkBox>
                     <w:sizeAuto/>
                     <w:default w:val="1"/>
-                    <w:checked/>
+                    <w:checked w:val="1"/>
                   </w:checkBox>
                 </w:ffData>
               </w:fldChar>
@@ -22206,13 +21842,6 @@
                 <w:lang w:val="en-US" w:eastAsia="en-US" w:bidi="ar-SA"/>
               </w:rPr>
               <w:fldChar w:fldCharType="end"/>
-            </w:r>
-            <w:r>
-              <w:rPr>
-                <w:rFonts w:ascii="Wingdings" w:hAnsi="Wingdings"/>
-                <w:sz w:val="22"/>
-              </w:rPr>
-              <w:sym w:font="Wingdings" w:char="00FE"/>
             </w:r>
           </w:p>
         </w:tc>
@@ -22426,7 +22055,7 @@
                   <w:checkBox>
                     <w:sizeAuto/>
                     <w:default w:val="1"/>
-                    <w:checked/>
+                    <w:checked w:val="1"/>
                   </w:checkBox>
                 </w:ffData>
               </w:fldChar>
@@ -22459,13 +22088,6 @@
               <w:fldChar w:fldCharType="end"/>
             </w:r>
             <w:bookmarkEnd w:id="2"/>
-            <w:r>
-              <w:rPr>
-                <w:rFonts w:ascii="Wingdings" w:hAnsi="Wingdings"/>
-                <w:sz w:val="22"/>
-              </w:rPr>
-              <w:sym w:font="Wingdings" w:char="00FE"/>
-            </w:r>
           </w:p>
         </w:tc>
         <w:tc>
@@ -22881,8 +22503,8 @@
                   <w:calcOnExit w:val="0"/>
                   <w:checkBox>
                     <w:sizeAuto/>
-                    <w:default w:val="0"/>
-                    <w:checked w:val="0"/>
+                    <w:default w:val="1"/>
+                    <w:checked w:val="1"/>
                   </w:checkBox>
                 </w:ffData>
               </w:fldChar>
@@ -22907,13 +22529,6 @@
                 <w:highlight w:val="lightGray"/>
               </w:rPr>
               <w:fldChar w:fldCharType="end"/>
-            </w:r>
-            <w:r>
-              <w:rPr>
-                <w:rFonts w:ascii="Wingdings" w:hAnsi="Wingdings"/>
-                <w:sz w:val="22"/>
-              </w:rPr>
-              <w:sym w:font="Wingdings" w:char="00FE"/>
             </w:r>
           </w:p>
         </w:tc>
@@ -23155,8 +22770,8 @@
                   <w:calcOnExit w:val="0"/>
                   <w:checkBox>
                     <w:sizeAuto/>
-                    <w:default w:val="0"/>
-                    <w:checked w:val="0"/>
+                    <w:default w:val="1"/>
+                    <w:checked w:val="1"/>
                   </w:checkBox>
                 </w:ffData>
               </w:fldChar>
@@ -23181,13 +22796,6 @@
                 <w:highlight w:val="lightGray"/>
               </w:rPr>
               <w:fldChar w:fldCharType="end"/>
-            </w:r>
-            <w:r>
-              <w:rPr>
-                <w:rFonts w:ascii="Wingdings" w:hAnsi="Wingdings"/>
-                <w:sz w:val="22"/>
-              </w:rPr>
-              <w:sym w:font="Wingdings" w:char="00FE"/>
             </w:r>
           </w:p>
         </w:tc>
@@ -23543,8 +23151,8 @@
                   <w:calcOnExit w:val="0"/>
                   <w:checkBox>
                     <w:sizeAuto/>
-                    <w:default w:val="0"/>
-                    <w:checked w:val="0"/>
+                    <w:default w:val="1"/>
+                    <w:checked w:val="1"/>
                   </w:checkBox>
                 </w:ffData>
               </w:fldChar>
@@ -23569,13 +23177,6 @@
                 <w:highlight w:val="lightGray"/>
               </w:rPr>
               <w:fldChar w:fldCharType="end"/>
-            </w:r>
-            <w:r>
-              <w:rPr>
-                <w:rFonts w:ascii="Wingdings" w:hAnsi="Wingdings"/>
-                <w:sz w:val="22"/>
-              </w:rPr>
-              <w:sym w:font="Wingdings" w:char="00FE"/>
             </w:r>
           </w:p>
         </w:tc>
@@ -23816,8 +23417,8 @@
                   <w:calcOnExit w:val="0"/>
                   <w:checkBox>
                     <w:sizeAuto/>
-                    <w:default w:val="0"/>
-                    <w:checked w:val="0"/>
+                    <w:default w:val="1"/>
+                    <w:checked w:val="1"/>
                   </w:checkBox>
                 </w:ffData>
               </w:fldChar>
@@ -23842,13 +23443,6 @@
                 <w:highlight w:val="lightGray"/>
               </w:rPr>
               <w:fldChar w:fldCharType="end"/>
-            </w:r>
-            <w:r>
-              <w:rPr>
-                <w:rFonts w:ascii="Wingdings" w:hAnsi="Wingdings"/>
-                <w:sz w:val="22"/>
-              </w:rPr>
-              <w:sym w:font="Wingdings" w:char="00FE"/>
             </w:r>
           </w:p>
         </w:tc>
@@ -24091,8 +23685,8 @@
                   <w:calcOnExit w:val="0"/>
                   <w:checkBox>
                     <w:sizeAuto/>
-                    <w:default w:val="0"/>
-                    <w:checked w:val="0"/>
+                    <w:default w:val="1"/>
+                    <w:checked w:val="1"/>
                   </w:checkBox>
                 </w:ffData>
               </w:fldChar>
@@ -24117,13 +23711,6 @@
                 <w:highlight w:val="lightGray"/>
               </w:rPr>
               <w:fldChar w:fldCharType="end"/>
-            </w:r>
-            <w:r>
-              <w:rPr>
-                <w:rFonts w:ascii="Wingdings" w:hAnsi="Wingdings"/>
-                <w:sz w:val="22"/>
-              </w:rPr>
-              <w:sym w:font="Wingdings" w:char="00FE"/>
             </w:r>
           </w:p>
         </w:tc>
@@ -24365,8 +23952,8 @@
                   <w:calcOnExit w:val="0"/>
                   <w:checkBox>
                     <w:sizeAuto/>
-                    <w:default w:val="0"/>
-                    <w:checked w:val="0"/>
+                    <w:default w:val="1"/>
+                    <w:checked w:val="1"/>
                   </w:checkBox>
                 </w:ffData>
               </w:fldChar>
@@ -24391,13 +23978,6 @@
                 <w:highlight w:val="lightGray"/>
               </w:rPr>
               <w:fldChar w:fldCharType="end"/>
-            </w:r>
-            <w:r>
-              <w:rPr>
-                <w:rFonts w:ascii="Wingdings" w:hAnsi="Wingdings"/>
-                <w:sz w:val="22"/>
-              </w:rPr>
-              <w:sym w:font="Wingdings" w:char="00FE"/>
             </w:r>
           </w:p>
         </w:tc>
@@ -24852,8 +24432,8 @@
                   <w:calcOnExit w:val="0"/>
                   <w:checkBox>
                     <w:sizeAuto/>
-                    <w:default w:val="0"/>
-                    <w:checked w:val="0"/>
+                    <w:default w:val="1"/>
+                    <w:checked w:val="1"/>
                   </w:checkBox>
                 </w:ffData>
               </w:fldChar>
@@ -24878,13 +24458,6 @@
                 <w:highlight w:val="lightGray"/>
               </w:rPr>
               <w:fldChar w:fldCharType="end"/>
-            </w:r>
-            <w:r>
-              <w:rPr>
-                <w:rFonts w:ascii="Wingdings" w:hAnsi="Wingdings"/>
-                <w:sz w:val="22"/>
-              </w:rPr>
-              <w:sym w:font="Wingdings" w:char="00FE"/>
             </w:r>
           </w:p>
         </w:tc>
@@ -25111,8 +24684,8 @@
                   <w:calcOnExit w:val="0"/>
                   <w:checkBox>
                     <w:sizeAuto/>
-                    <w:default w:val="0"/>
-                    <w:checked w:val="0"/>
+                    <w:default w:val="1"/>
+                    <w:checked w:val="1"/>
                   </w:checkBox>
                 </w:ffData>
               </w:fldChar>
@@ -25137,13 +24710,6 @@
                 <w:highlight w:val="lightGray"/>
               </w:rPr>
               <w:fldChar w:fldCharType="end"/>
-            </w:r>
-            <w:r>
-              <w:rPr>
-                <w:rFonts w:ascii="Wingdings" w:hAnsi="Wingdings"/>
-                <w:sz w:val="22"/>
-              </w:rPr>
-              <w:sym w:font="Wingdings" w:char="00FE"/>
             </w:r>
           </w:p>
         </w:tc>
@@ -25370,8 +24936,8 @@
                   <w:calcOnExit w:val="0"/>
                   <w:checkBox>
                     <w:sizeAuto/>
-                    <w:default w:val="0"/>
-                    <w:checked w:val="0"/>
+                    <w:default w:val="1"/>
+                    <w:checked w:val="1"/>
                   </w:checkBox>
                 </w:ffData>
               </w:fldChar>
@@ -25396,13 +24962,6 @@
                 <w:highlight w:val="lightGray"/>
               </w:rPr>
               <w:fldChar w:fldCharType="end"/>
-            </w:r>
-            <w:r>
-              <w:rPr>
-                <w:rFonts w:ascii="Wingdings" w:hAnsi="Wingdings"/>
-                <w:sz w:val="22"/>
-              </w:rPr>
-              <w:sym w:font="Wingdings" w:char="00FE"/>
             </w:r>
           </w:p>
         </w:tc>
@@ -25629,8 +25188,8 @@
                   <w:calcOnExit w:val="0"/>
                   <w:checkBox>
                     <w:sizeAuto/>
-                    <w:default w:val="0"/>
-                    <w:checked w:val="0"/>
+                    <w:default w:val="1"/>
+                    <w:checked w:val="1"/>
                   </w:checkBox>
                 </w:ffData>
               </w:fldChar>
@@ -25655,13 +25214,6 @@
                 <w:highlight w:val="lightGray"/>
               </w:rPr>
               <w:fldChar w:fldCharType="end"/>
-            </w:r>
-            <w:r>
-              <w:rPr>
-                <w:rFonts w:ascii="Wingdings" w:hAnsi="Wingdings"/>
-                <w:sz w:val="22"/>
-              </w:rPr>
-              <w:sym w:font="Wingdings" w:char="00FE"/>
             </w:r>
           </w:p>
         </w:tc>
@@ -25990,8 +25542,8 @@
                   <w:calcOnExit w:val="0"/>
                   <w:checkBox>
                     <w:sizeAuto/>
-                    <w:default w:val="0"/>
-                    <w:checked w:val="0"/>
+                    <w:default w:val="1"/>
+                    <w:checked w:val="1"/>
                   </w:checkBox>
                 </w:ffData>
               </w:fldChar>
@@ -26016,13 +25568,6 @@
                 <w:highlight w:val="lightGray"/>
               </w:rPr>
               <w:fldChar w:fldCharType="end"/>
-            </w:r>
-            <w:r>
-              <w:rPr>
-                <w:rFonts w:ascii="Wingdings" w:hAnsi="Wingdings"/>
-                <w:sz w:val="22"/>
-              </w:rPr>
-              <w:sym w:font="Wingdings" w:char="00FE"/>
             </w:r>
           </w:p>
         </w:tc>
@@ -26559,13 +26104,6 @@
                 <w:highlight w:val="lightGray"/>
               </w:rPr>
             </w:pPr>
-            <w:r>
-              <w:rPr>
-                <w:rFonts w:ascii="Wingdings" w:hAnsi="Wingdings"/>
-                <w:sz w:val="22"/>
-              </w:rPr>
-              <w:sym w:font="Wingdings" w:char="00FE"/>
-            </w:r>
           </w:p>
           <w:p>
             <w:pPr>
@@ -26588,8 +26126,8 @@
                   <w:calcOnExit w:val="0"/>
                   <w:checkBox>
                     <w:sizeAuto/>
-                    <w:default w:val="0"/>
-                    <w:checked w:val="0"/>
+                    <w:default w:val="1"/>
+                    <w:checked w:val="1"/>
                   </w:checkBox>
                 </w:ffData>
               </w:fldChar>
@@ -26647,8 +26185,8 @@
                   <w:calcOnExit w:val="0"/>
                   <w:checkBox>
                     <w:sizeAuto/>
-                    <w:default w:val="0"/>
-                    <w:checked w:val="0"/>
+                    <w:default w:val="1"/>
+                    <w:checked w:val="1"/>
                   </w:checkBox>
                 </w:ffData>
               </w:fldChar>
@@ -27152,8 +26690,8 @@
                   <w:calcOnExit w:val="0"/>
                   <w:checkBox>
                     <w:sizeAuto/>
-                    <w:default w:val="0"/>
-                    <w:checked w:val="0"/>
+                    <w:default w:val="1"/>
+                    <w:checked w:val="1"/>
                   </w:checkBox>
                 </w:ffData>
               </w:fldChar>
@@ -27178,13 +26716,6 @@
                 <w:highlight w:val="lightGray"/>
               </w:rPr>
               <w:fldChar w:fldCharType="end"/>
-            </w:r>
-            <w:r>
-              <w:rPr>
-                <w:rFonts w:ascii="Wingdings" w:hAnsi="Wingdings"/>
-                <w:sz w:val="22"/>
-              </w:rPr>
-              <w:sym w:font="Wingdings" w:char="00FE"/>
             </w:r>
           </w:p>
         </w:tc>
@@ -27417,8 +26948,8 @@
                   <w:calcOnExit w:val="0"/>
                   <w:checkBox>
                     <w:sizeAuto/>
-                    <w:default w:val="0"/>
-                    <w:checked w:val="0"/>
+                    <w:default w:val="1"/>
+                    <w:checked w:val="1"/>
                   </w:checkBox>
                 </w:ffData>
               </w:fldChar>
@@ -27440,13 +26971,6 @@
                 <w:rFonts w:ascii="Arial" w:hAnsi="Arial" w:cs="Arial"/>
               </w:rPr>
               <w:fldChar w:fldCharType="end"/>
-            </w:r>
-            <w:r>
-              <w:rPr>
-                <w:rFonts w:ascii="Wingdings" w:hAnsi="Wingdings"/>
-                <w:sz w:val="22"/>
-              </w:rPr>
-              <w:sym w:font="Wingdings" w:char="00FE"/>
             </w:r>
           </w:p>
         </w:tc>
@@ -27660,8 +27184,8 @@
                   <w:calcOnExit w:val="0"/>
                   <w:checkBox>
                     <w:sizeAuto/>
-                    <w:default w:val="0"/>
-                    <w:checked w:val="0"/>
+                    <w:default w:val="1"/>
+                    <w:checked w:val="1"/>
                   </w:checkBox>
                 </w:ffData>
               </w:fldChar>
@@ -27686,13 +27210,6 @@
                 <w:highlight w:val="lightGray"/>
               </w:rPr>
               <w:fldChar w:fldCharType="end"/>
-            </w:r>
-            <w:r>
-              <w:rPr>
-                <w:rFonts w:ascii="Wingdings" w:hAnsi="Wingdings"/>
-                <w:sz w:val="22"/>
-              </w:rPr>
-              <w:sym w:font="Wingdings" w:char="00FE"/>
             </w:r>
           </w:p>
         </w:tc>
@@ -27907,8 +27424,8 @@
                   <w:calcOnExit w:val="0"/>
                   <w:checkBox>
                     <w:sizeAuto/>
-                    <w:default w:val="0"/>
-                    <w:checked w:val="0"/>
+                    <w:default w:val="1"/>
+                    <w:checked w:val="1"/>
                   </w:checkBox>
                 </w:ffData>
               </w:fldChar>
@@ -27933,13 +27450,6 @@
                 <w:highlight w:val="lightGray"/>
               </w:rPr>
               <w:fldChar w:fldCharType="end"/>
-            </w:r>
-            <w:r>
-              <w:rPr>
-                <w:rFonts w:ascii="Wingdings" w:hAnsi="Wingdings"/>
-                <w:sz w:val="22"/>
-              </w:rPr>
-              <w:sym w:font="Wingdings" w:char="00FE"/>
             </w:r>
           </w:p>
           <w:p>
@@ -28188,8 +27698,8 @@
                   <w:calcOnExit w:val="0"/>
                   <w:checkBox>
                     <w:sizeAuto/>
-                    <w:default w:val="0"/>
-                    <w:checked w:val="0"/>
+                    <w:default w:val="1"/>
+                    <w:checked w:val="1"/>
                   </w:checkBox>
                 </w:ffData>
               </w:fldChar>
@@ -28220,13 +27730,6 @@
                 <w:lang w:val="en-US"/>
               </w:rPr>
               <w:fldChar w:fldCharType="end"/>
-            </w:r>
-            <w:r>
-              <w:rPr>
-                <w:rFonts w:ascii="Wingdings" w:hAnsi="Wingdings"/>
-                <w:sz w:val="22"/>
-              </w:rPr>
-              <w:sym w:font="Wingdings" w:char="00FE"/>
             </w:r>
           </w:p>
         </w:tc>
@@ -28473,8 +27976,8 @@
                   <w:calcOnExit w:val="0"/>
                   <w:checkBox>
                     <w:sizeAuto/>
-                    <w:default w:val="0"/>
-                    <w:checked w:val="0"/>
+                    <w:default w:val="1"/>
+                    <w:checked w:val="1"/>
                   </w:checkBox>
                 </w:ffData>
               </w:fldChar>
@@ -28505,13 +28008,6 @@
                 <w:lang w:val="en-US"/>
               </w:rPr>
               <w:fldChar w:fldCharType="end"/>
-            </w:r>
-            <w:r>
-              <w:rPr>
-                <w:rFonts w:ascii="Wingdings" w:hAnsi="Wingdings"/>
-                <w:sz w:val="22"/>
-              </w:rPr>
-              <w:sym w:font="Wingdings" w:char="00FE"/>
             </w:r>
           </w:p>
         </w:tc>
@@ -28737,8 +28233,8 @@
                   <w:calcOnExit w:val="0"/>
                   <w:checkBox>
                     <w:sizeAuto/>
-                    <w:default w:val="0"/>
-                    <w:checked w:val="0"/>
+                    <w:default w:val="1"/>
+                    <w:checked w:val="1"/>
                   </w:checkBox>
                 </w:ffData>
               </w:fldChar>
@@ -28763,13 +28259,6 @@
                 <w:highlight w:val="lightGray"/>
               </w:rPr>
               <w:fldChar w:fldCharType="end"/>
-            </w:r>
-            <w:r>
-              <w:rPr>
-                <w:rFonts w:ascii="Wingdings" w:hAnsi="Wingdings"/>
-                <w:sz w:val="22"/>
-              </w:rPr>
-              <w:sym w:font="Wingdings" w:char="00FE"/>
             </w:r>
           </w:p>
         </w:tc>
@@ -29327,8 +28816,8 @@
                   <w:calcOnExit w:val="0"/>
                   <w:checkBox>
                     <w:sizeAuto/>
-                    <w:default w:val="0"/>
-                    <w:checked w:val="0"/>
+                    <w:default w:val="1"/>
+                    <w:checked w:val="1"/>
                   </w:checkBox>
                 </w:ffData>
               </w:fldChar>
@@ -29353,13 +28842,6 @@
                 <w:highlight w:val="lightGray"/>
               </w:rPr>
               <w:fldChar w:fldCharType="end"/>
-            </w:r>
-            <w:r>
-              <w:rPr>
-                <w:rFonts w:ascii="Wingdings" w:hAnsi="Wingdings"/>
-                <w:sz w:val="22"/>
-              </w:rPr>
-              <w:sym w:font="Wingdings" w:char="00FE"/>
             </w:r>
           </w:p>
           <w:p>
@@ -29669,8 +29151,8 @@
                   <w:calcOnExit w:val="0"/>
                   <w:checkBox>
                     <w:sizeAuto/>
-                    <w:default w:val="0"/>
-                    <w:checked w:val="0"/>
+                    <w:default w:val="1"/>
+                    <w:checked w:val="1"/>
                   </w:checkBox>
                 </w:ffData>
               </w:fldChar>
@@ -29695,13 +29177,6 @@
                 <w:highlight w:val="lightGray"/>
               </w:rPr>
               <w:fldChar w:fldCharType="end"/>
-            </w:r>
-            <w:r>
-              <w:rPr>
-                <w:rFonts w:ascii="Wingdings" w:hAnsi="Wingdings"/>
-                <w:sz w:val="22"/>
-              </w:rPr>
-              <w:sym w:font="Wingdings" w:char="00FE"/>
             </w:r>
           </w:p>
         </w:tc>
@@ -29957,8 +29432,8 @@
                   <w:calcOnExit w:val="0"/>
                   <w:checkBox>
                     <w:sizeAuto/>
-                    <w:default w:val="0"/>
-                    <w:checked w:val="0"/>
+                    <w:default w:val="1"/>
+                    <w:checked w:val="1"/>
                   </w:checkBox>
                 </w:ffData>
               </w:fldChar>
@@ -29983,13 +29458,6 @@
                 <w:highlight w:val="lightGray"/>
               </w:rPr>
               <w:fldChar w:fldCharType="end"/>
-            </w:r>
-            <w:r>
-              <w:rPr>
-                <w:rFonts w:ascii="Wingdings" w:hAnsi="Wingdings"/>
-                <w:sz w:val="22"/>
-              </w:rPr>
-              <w:sym w:font="Wingdings" w:char="00FE"/>
             </w:r>
           </w:p>
         </w:tc>
@@ -30267,8 +29735,8 @@
                   <w:calcOnExit w:val="0"/>
                   <w:checkBox>
                     <w:sizeAuto/>
-                    <w:default w:val="0"/>
-                    <w:checked w:val="0"/>
+                    <w:default w:val="1"/>
+                    <w:checked w:val="1"/>
                   </w:checkBox>
                 </w:ffData>
               </w:fldChar>
@@ -30293,13 +29761,6 @@
                 <w:highlight w:val="lightGray"/>
               </w:rPr>
               <w:fldChar w:fldCharType="end"/>
-            </w:r>
-            <w:r>
-              <w:rPr>
-                <w:rFonts w:ascii="Wingdings" w:hAnsi="Wingdings"/>
-                <w:sz w:val="22"/>
-              </w:rPr>
-              <w:sym w:font="Wingdings" w:char="00FE"/>
             </w:r>
           </w:p>
         </w:tc>
@@ -30524,8 +29985,8 @@
                   <w:calcOnExit w:val="0"/>
                   <w:checkBox>
                     <w:sizeAuto/>
-                    <w:default w:val="0"/>
-                    <w:checked w:val="0"/>
+                    <w:default w:val="1"/>
+                    <w:checked w:val="1"/>
                   </w:checkBox>
                 </w:ffData>
               </w:fldChar>
@@ -30550,13 +30011,6 @@
                 <w:highlight w:val="lightGray"/>
               </w:rPr>
               <w:fldChar w:fldCharType="end"/>
-            </w:r>
-            <w:r>
-              <w:rPr>
-                <w:rFonts w:ascii="Wingdings" w:hAnsi="Wingdings"/>
-                <w:sz w:val="22"/>
-              </w:rPr>
-              <w:sym w:font="Wingdings" w:char="00FE"/>
             </w:r>
           </w:p>
         </w:tc>
@@ -30799,8 +30253,8 @@
                   <w:calcOnExit w:val="0"/>
                   <w:checkBox>
                     <w:sizeAuto/>
-                    <w:default w:val="0"/>
-                    <w:checked w:val="0"/>
+                    <w:default w:val="1"/>
+                    <w:checked w:val="1"/>
                   </w:checkBox>
                 </w:ffData>
               </w:fldChar>
@@ -30825,13 +30279,6 @@
                 <w:highlight w:val="lightGray"/>
               </w:rPr>
               <w:fldChar w:fldCharType="end"/>
-            </w:r>
-            <w:r>
-              <w:rPr>
-                <w:rFonts w:ascii="Wingdings" w:hAnsi="Wingdings"/>
-                <w:sz w:val="22"/>
-              </w:rPr>
-              <w:sym w:font="Wingdings" w:char="00FE"/>
             </w:r>
           </w:p>
         </w:tc>
@@ -31111,8 +30558,8 @@
                   <w:calcOnExit w:val="0"/>
                   <w:checkBox>
                     <w:sizeAuto/>
-                    <w:default w:val="0"/>
-                    <w:checked w:val="0"/>
+                    <w:default w:val="1"/>
+                    <w:checked w:val="1"/>
                   </w:checkBox>
                 </w:ffData>
               </w:fldChar>
@@ -31137,13 +30584,6 @@
                 <w:highlight w:val="lightGray"/>
               </w:rPr>
               <w:fldChar w:fldCharType="end"/>
-            </w:r>
-            <w:r>
-              <w:rPr>
-                <w:rFonts w:ascii="Wingdings" w:hAnsi="Wingdings"/>
-                <w:sz w:val="22"/>
-              </w:rPr>
-              <w:sym w:font="Wingdings" w:char="00FE"/>
             </w:r>
           </w:p>
         </w:tc>
@@ -31435,8 +30875,8 @@
                   <w:calcOnExit w:val="0"/>
                   <w:checkBox>
                     <w:sizeAuto/>
-                    <w:default w:val="0"/>
-                    <w:checked w:val="0"/>
+                    <w:default w:val="1"/>
+                    <w:checked w:val="1"/>
                   </w:checkBox>
                 </w:ffData>
               </w:fldChar>
@@ -31461,13 +30901,6 @@
                 <w:lang w:val="en-US"/>
               </w:rPr>
               <w:fldChar w:fldCharType="end"/>
-            </w:r>
-            <w:r>
-              <w:rPr>
-                <w:rFonts w:ascii="Wingdings" w:hAnsi="Wingdings"/>
-                <w:sz w:val="22"/>
-              </w:rPr>
-              <w:sym w:font="Wingdings" w:char="00FE"/>
             </w:r>
           </w:p>
         </w:tc>
@@ -31803,8 +31236,8 @@
                   <w:calcOnExit w:val="0"/>
                   <w:checkBox>
                     <w:sizeAuto/>
-                    <w:default w:val="0"/>
-                    <w:checked w:val="0"/>
+                    <w:default w:val="1"/>
+                    <w:checked w:val="1"/>
                   </w:checkBox>
                 </w:ffData>
               </w:fldChar>
@@ -31826,13 +31259,6 @@
                 <w:rFonts w:ascii="Arial" w:hAnsi="Arial" w:cs="Arial"/>
               </w:rPr>
               <w:fldChar w:fldCharType="end"/>
-            </w:r>
-            <w:r>
-              <w:rPr>
-                <w:rFonts w:ascii="Wingdings" w:hAnsi="Wingdings"/>
-                <w:sz w:val="22"/>
-              </w:rPr>
-              <w:sym w:font="Wingdings" w:char="00FE"/>
             </w:r>
           </w:p>
         </w:tc>
@@ -32345,8 +31771,8 @@
                   <w:calcOnExit w:val="0"/>
                   <w:checkBox>
                     <w:sizeAuto/>
-                    <w:default w:val="0"/>
-                    <w:checked w:val="0"/>
+                    <w:default w:val="1"/>
+                    <w:checked w:val="1"/>
                   </w:checkBox>
                 </w:ffData>
               </w:fldChar>
@@ -32368,13 +31794,6 @@
                 <w:rFonts w:ascii="Arial" w:hAnsi="Arial" w:cs="Arial"/>
               </w:rPr>
               <w:fldChar w:fldCharType="end"/>
-            </w:r>
-            <w:r>
-              <w:rPr>
-                <w:rFonts w:ascii="Wingdings" w:hAnsi="Wingdings"/>
-                <w:sz w:val="22"/>
-              </w:rPr>
-              <w:sym w:font="Wingdings" w:char="00FE"/>
             </w:r>
           </w:p>
         </w:tc>
@@ -32603,8 +32022,8 @@
                   <w:calcOnExit w:val="0"/>
                   <w:checkBox>
                     <w:sizeAuto/>
-                    <w:default w:val="0"/>
-                    <w:checked w:val="0"/>
+                    <w:default w:val="1"/>
+                    <w:checked w:val="1"/>
                   </w:checkBox>
                 </w:ffData>
               </w:fldChar>
@@ -32626,13 +32045,6 @@
                 <w:rFonts w:ascii="Arial" w:hAnsi="Arial" w:cs="Arial"/>
               </w:rPr>
               <w:fldChar w:fldCharType="end"/>
-            </w:r>
-            <w:r>
-              <w:rPr>
-                <w:rFonts w:ascii="Wingdings" w:hAnsi="Wingdings"/>
-                <w:sz w:val="22"/>
-              </w:rPr>
-              <w:sym w:font="Wingdings" w:char="00FE"/>
             </w:r>
           </w:p>
         </w:tc>
@@ -32845,8 +32257,8 @@
                   <w:calcOnExit w:val="0"/>
                   <w:checkBox>
                     <w:sizeAuto/>
-                    <w:default w:val="0"/>
-                    <w:checked w:val="0"/>
+                    <w:default w:val="1"/>
+                    <w:checked w:val="1"/>
                   </w:checkBox>
                 </w:ffData>
               </w:fldChar>
@@ -32868,13 +32280,6 @@
                 <w:rFonts w:ascii="Arial" w:hAnsi="Arial" w:cs="Arial"/>
               </w:rPr>
               <w:fldChar w:fldCharType="end"/>
-            </w:r>
-            <w:r>
-              <w:rPr>
-                <w:rFonts w:ascii="Wingdings" w:hAnsi="Wingdings"/>
-                <w:sz w:val="22"/>
-              </w:rPr>
-              <w:sym w:font="Wingdings" w:char="00FE"/>
             </w:r>
           </w:p>
         </w:tc>
@@ -33198,8 +32603,8 @@
                   <w:calcOnExit w:val="0"/>
                   <w:checkBox>
                     <w:sizeAuto/>
-                    <w:default w:val="0"/>
-                    <w:checked w:val="0"/>
+                    <w:default w:val="1"/>
+                    <w:checked w:val="1"/>
                   </w:checkBox>
                 </w:ffData>
               </w:fldChar>
@@ -33221,13 +32626,6 @@
                 <w:rFonts w:ascii="Arial" w:hAnsi="Arial" w:cs="Arial"/>
               </w:rPr>
               <w:fldChar w:fldCharType="end"/>
-            </w:r>
-            <w:r>
-              <w:rPr>
-                <w:rFonts w:ascii="Wingdings" w:hAnsi="Wingdings"/>
-                <w:sz w:val="22"/>
-              </w:rPr>
-              <w:sym w:font="Wingdings" w:char="00FE"/>
             </w:r>
           </w:p>
         </w:tc>
@@ -33551,8 +32949,8 @@
                   <w:calcOnExit w:val="0"/>
                   <w:checkBox>
                     <w:sizeAuto/>
-                    <w:default w:val="0"/>
-                    <w:checked w:val="0"/>
+                    <w:default w:val="1"/>
+                    <w:checked w:val="1"/>
                   </w:checkBox>
                 </w:ffData>
               </w:fldChar>
@@ -33574,13 +32972,6 @@
                 <w:rFonts w:ascii="Arial" w:hAnsi="Arial" w:cs="Arial"/>
               </w:rPr>
               <w:fldChar w:fldCharType="end"/>
-            </w:r>
-            <w:r>
-              <w:rPr>
-                <w:rFonts w:ascii="Wingdings" w:hAnsi="Wingdings"/>
-                <w:sz w:val="22"/>
-              </w:rPr>
-              <w:sym w:font="Wingdings" w:char="00FE"/>
             </w:r>
           </w:p>
         </w:tc>
@@ -33940,8 +33331,8 @@
                   <w:calcOnExit w:val="0"/>
                   <w:checkBox>
                     <w:sizeAuto/>
-                    <w:default w:val="0"/>
-                    <w:checked w:val="0"/>
+                    <w:default w:val="1"/>
+                    <w:checked w:val="1"/>
                   </w:checkBox>
                 </w:ffData>
               </w:fldChar>
@@ -33963,13 +33354,6 @@
                 <w:rFonts w:ascii="Arial" w:hAnsi="Arial" w:cs="Arial"/>
               </w:rPr>
               <w:fldChar w:fldCharType="end"/>
-            </w:r>
-            <w:r>
-              <w:rPr>
-                <w:rFonts w:ascii="Wingdings" w:hAnsi="Wingdings"/>
-                <w:sz w:val="22"/>
-              </w:rPr>
-              <w:sym w:font="Wingdings" w:char="00FE"/>
             </w:r>
           </w:p>
         </w:tc>
@@ -34224,8 +33608,8 @@
                   <w:calcOnExit w:val="0"/>
                   <w:checkBox>
                     <w:sizeAuto/>
-                    <w:default w:val="0"/>
-                    <w:checked w:val="0"/>
+                    <w:default w:val="1"/>
+                    <w:checked w:val="1"/>
                   </w:checkBox>
                 </w:ffData>
               </w:fldChar>
@@ -34247,13 +33631,6 @@
                 <w:rFonts w:ascii="Arial" w:hAnsi="Arial" w:cs="Arial"/>
               </w:rPr>
               <w:fldChar w:fldCharType="end"/>
-            </w:r>
-            <w:r>
-              <w:rPr>
-                <w:rFonts w:ascii="Wingdings" w:hAnsi="Wingdings"/>
-                <w:sz w:val="22"/>
-              </w:rPr>
-              <w:sym w:font="Wingdings" w:char="00FE"/>
             </w:r>
           </w:p>
         </w:tc>
@@ -34530,8 +33907,8 @@
                   <w:calcOnExit w:val="0"/>
                   <w:checkBox>
                     <w:sizeAuto/>
-                    <w:default w:val="0"/>
-                    <w:checked w:val="0"/>
+                    <w:default w:val="1"/>
+                    <w:checked w:val="1"/>
                   </w:checkBox>
                 </w:ffData>
               </w:fldChar>
@@ -34556,13 +33933,6 @@
                 <w:highlight w:val="lightGray"/>
               </w:rPr>
               <w:fldChar w:fldCharType="end"/>
-            </w:r>
-            <w:r>
-              <w:rPr>
-                <w:rFonts w:ascii="Wingdings" w:hAnsi="Wingdings"/>
-                <w:sz w:val="22"/>
-              </w:rPr>
-              <w:sym w:font="Wingdings" w:char="00FE"/>
             </w:r>
           </w:p>
         </w:tc>
@@ -34928,13 +34298,6 @@
               </w:rPr>
               <w:fldChar w:fldCharType="end"/>
             </w:r>
-            <w:r>
-              <w:rPr>
-                <w:rFonts w:ascii="Wingdings" w:hAnsi="Wingdings"/>
-                <w:sz w:val="22"/>
-              </w:rPr>
-              <w:sym w:font="Wingdings" w:char="00FE"/>
-            </w:r>
           </w:p>
         </w:tc>
         <w:tc>
@@ -34966,8 +34329,8 @@
                   <w:calcOnExit w:val="0"/>
                   <w:checkBox>
                     <w:sizeAuto/>
-                    <w:default w:val="0"/>
-                    <w:checked w:val="0"/>
+                    <w:default w:val="1"/>
+                    <w:checked w:val="1"/>
                   </w:checkBox>
                 </w:ffData>
               </w:fldChar>
@@ -35019,7 +34382,7 @@
               <w:rPr>
                 <w:rFonts w:ascii="Arial" w:hAnsi="Arial" w:cs="Arial"/>
               </w:rPr>
-              <w:t>No. Subcontractors are not used for tests provided to Cerba Research. N/A.</w:t>
+              <w:t>N/A. Subcontractors are not used for tests provided to Cerba Research.</w:t>
             </w:r>
           </w:p>
           <w:p>

</xml_diff>